<commit_message>
Actusalizacion de archivos de dise��o y fuentes
</commit_message>
<xml_diff>
--- a/HV/Hoja De Vida/2026 Dr.Ing. Dumar Alejandro Rodriguez Mesa HDV.docx
+++ b/HV/Hoja De Vida/2026 Dr.Ing. Dumar Alejandro Rodriguez Mesa HDV.docx
@@ -1043,76 +1043,6 @@
     </w:p>
     <w:p>
       <w:pPr>
-        <w:spacing w:after="0" w:line="240" w:lineRule="auto"/>
-        <w:ind w:left="709" w:firstLine="425"/>
-        <w:jc w:val="both"/>
-        <w:rPr>
-          <w:rFonts w:ascii="Arial" w:eastAsia="Tahoma" w:hAnsi="Arial" w:cs="Arial"/>
-        </w:rPr>
-      </w:pPr>
-    </w:p>
-    <w:p>
-      <w:pPr>
-        <w:spacing w:after="0" w:line="240" w:lineRule="auto"/>
-        <w:ind w:left="709" w:firstLine="425"/>
-        <w:jc w:val="both"/>
-        <w:rPr>
-          <w:rFonts w:ascii="Arial" w:eastAsia="Tahoma" w:hAnsi="Arial" w:cs="Arial"/>
-        </w:rPr>
-      </w:pPr>
-    </w:p>
-    <w:p>
-      <w:pPr>
-        <w:spacing w:after="0" w:line="240" w:lineRule="auto"/>
-        <w:ind w:left="709" w:firstLine="425"/>
-        <w:jc w:val="both"/>
-        <w:rPr>
-          <w:rFonts w:ascii="Arial" w:eastAsia="Tahoma" w:hAnsi="Arial" w:cs="Arial"/>
-        </w:rPr>
-      </w:pPr>
-    </w:p>
-    <w:p>
-      <w:pPr>
-        <w:spacing w:after="0" w:line="240" w:lineRule="auto"/>
-        <w:ind w:left="709" w:firstLine="425"/>
-        <w:jc w:val="both"/>
-        <w:rPr>
-          <w:rFonts w:ascii="Arial" w:eastAsia="Tahoma" w:hAnsi="Arial" w:cs="Arial"/>
-        </w:rPr>
-      </w:pPr>
-    </w:p>
-    <w:p>
-      <w:pPr>
-        <w:spacing w:after="0" w:line="240" w:lineRule="auto"/>
-        <w:ind w:left="709" w:firstLine="425"/>
-        <w:jc w:val="both"/>
-        <w:rPr>
-          <w:rFonts w:ascii="Arial" w:eastAsia="Tahoma" w:hAnsi="Arial" w:cs="Arial"/>
-        </w:rPr>
-      </w:pPr>
-    </w:p>
-    <w:p>
-      <w:pPr>
-        <w:spacing w:after="0" w:line="240" w:lineRule="auto"/>
-        <w:ind w:left="709" w:firstLine="425"/>
-        <w:jc w:val="both"/>
-        <w:rPr>
-          <w:rFonts w:ascii="Arial" w:eastAsia="Tahoma" w:hAnsi="Arial" w:cs="Arial"/>
-        </w:rPr>
-      </w:pPr>
-    </w:p>
-    <w:p>
-      <w:pPr>
-        <w:spacing w:after="0" w:line="240" w:lineRule="auto"/>
-        <w:ind w:left="709" w:firstLine="425"/>
-        <w:jc w:val="both"/>
-        <w:rPr>
-          <w:rFonts w:ascii="Arial" w:eastAsia="Tahoma" w:hAnsi="Arial" w:cs="Arial"/>
-        </w:rPr>
-      </w:pPr>
-    </w:p>
-    <w:p>
-      <w:pPr>
         <w:pStyle w:val="NormalWeb"/>
         <w:rPr>
           <w:rFonts w:ascii="Arial" w:hAnsi="Arial" w:cs="Arial"/>
@@ -1123,6 +1053,7 @@
           <w:rStyle w:val="Fuerte"/>
           <w:rFonts w:ascii="Arial" w:hAnsi="Arial" w:cs="Arial"/>
         </w:rPr>
+        <w:lastRenderedPageBreak/>
         <w:t>Perfil:</w:t>
       </w:r>
     </w:p>
@@ -1616,7 +1547,6 @@
           <w:b/>
           <w:bCs/>
         </w:rPr>
-        <w:lastRenderedPageBreak/>
         <w:t>3. Análisis &amp; Negocio:</w:t>
       </w:r>
     </w:p>
@@ -1687,6 +1617,7 @@
           <w:b/>
           <w:bCs/>
         </w:rPr>
+        <w:lastRenderedPageBreak/>
         <w:t>Docencia y Capacitación:</w:t>
       </w:r>
       <w:r>
@@ -2021,7 +1952,6 @@
           <w:rStyle w:val="Fuerte"/>
           <w:rFonts w:ascii="Arial" w:hAnsi="Arial" w:cs="Arial"/>
         </w:rPr>
-        <w:lastRenderedPageBreak/>
         <w:t>SENA</w:t>
       </w:r>
     </w:p>
@@ -2079,6 +2009,7 @@
         <w:rPr>
           <w:rFonts w:ascii="Arial" w:hAnsi="Arial" w:cs="Arial"/>
         </w:rPr>
+        <w:lastRenderedPageBreak/>
         <w:t>Auditoría Informática - Conceptualización</w:t>
       </w:r>
     </w:p>
@@ -2491,7 +2422,6 @@
           <w:rStyle w:val="Fuerte"/>
           <w:rFonts w:ascii="Arial" w:hAnsi="Arial" w:cs="Arial"/>
         </w:rPr>
-        <w:lastRenderedPageBreak/>
         <w:t xml:space="preserve">Ingeniero de Sistemas - Digital Space </w:t>
       </w:r>
       <w:proofErr w:type="spellStart"/>
@@ -2574,6 +2504,7 @@
         <w:rPr>
           <w:rFonts w:ascii="Arial" w:hAnsi="Arial" w:cs="Arial"/>
         </w:rPr>
+        <w:lastRenderedPageBreak/>
         <w:t>Capacitación en microservicios con Spring Boot para ingenieros de Bancolombia.</w:t>
       </w:r>
     </w:p>
@@ -2954,7 +2885,6 @@
         <w:rPr>
           <w:rFonts w:ascii="Arial" w:hAnsi="Arial" w:cs="Arial"/>
         </w:rPr>
-        <w:lastRenderedPageBreak/>
         <w:t>Apoyo en la actualización de la base de datos de cobro administrativo coactivo del Departamento Administrativo de Tránsito y Transporte del Tolima.</w:t>
       </w:r>
     </w:p>
@@ -2975,6 +2905,7 @@
         <w:rPr>
           <w:rFonts w:ascii="Arial" w:hAnsi="Arial" w:cs="Arial"/>
         </w:rPr>
+        <w:lastRenderedPageBreak/>
         <w:t>Generación y carga de archivos planos para actualizar la plataforma tecnológica SIMIT (Sistema Integrado de Información sobre los Comparendos).</w:t>
       </w:r>
     </w:p>
@@ -3393,7 +3324,6 @@
         <w:rPr>
           <w:rFonts w:ascii="Arial" w:hAnsi="Arial" w:cs="Arial"/>
         </w:rPr>
-        <w:lastRenderedPageBreak/>
         <w:t xml:space="preserve">Lenguajes de Programación: Java, C#, .NET, Python, PHP, JavaScript, </w:t>
       </w:r>
       <w:proofErr w:type="spellStart"/>
@@ -3428,6 +3358,7 @@
         <w:rPr>
           <w:rFonts w:ascii="Arial" w:hAnsi="Arial" w:cs="Arial"/>
         </w:rPr>
+        <w:lastRenderedPageBreak/>
         <w:t>Desarrollo Web: HTML5, CSS3, Angular, React.js, Vue.js, Vanilla.js, Bootstrap, jQuery, AJAX.</w:t>
       </w:r>
     </w:p>

</xml_diff>